<commit_message>
Update Buku Panduan: Tambah Bab VI Panduan Hard Programmer dan Tutorial GitHub
</commit_message>
<xml_diff>
--- a/Buku_Panduan_Wiring_NURTURE_Margorejo.docx
+++ b/Buku_Panduan_Wiring_NURTURE_Margorejo.docx
@@ -6561,6 +6561,1574 @@
         <w:spacing w:before="0" w:after="80"/>
       </w:pPr>
     </w:p>
+    <w:p>
+      <w:r>
+        <w:br w:type="page"/>
+      </w:r>
+    </w:p>
+    <w:p>
+      <w:pPr>
+        <w:keepNext/>
+        <w:spacing w:before="360" w:after="120"/>
+      </w:pPr>
+      <w:r>
+        <w:rPr>
+          <w:rFonts w:ascii="Arial" w:hAnsi="Arial"/>
+          <w:b/>
+          <w:color w:val="1E4620"/>
+          <w:sz w:val="28"/>
+        </w:rPr>
+        <w:t>BAB VI. PANDUAN HARD PROGRAMMER (FIRMWARE &amp; GITHUB REPOSITORY)</w:t>
+      </w:r>
+    </w:p>
+    <w:p>
+      <w:r>
+        <w:t>Bab ini ditujukan khusus bagi teknisi pengembang perangkat lunak embedded (Hard Programmer) yang bertanggung jawab atas instalasi, pembaruan (flashing), penyesuaian parameter, dan pemeliharaan kode sumber firmware ESP32-S3 pada sistem NURTURE.</w:t>
+      </w:r>
+    </w:p>
+    <w:p>
+      <w:pPr>
+        <w:keepNext/>
+        <w:spacing w:before="240" w:after="80"/>
+      </w:pPr>
+      <w:r>
+        <w:rPr>
+          <w:rFonts w:ascii="Arial" w:hAnsi="Arial"/>
+          <w:b/>
+          <w:color w:val="2D6A4F"/>
+          <w:sz w:val="24"/>
+        </w:rPr>
+        <w:t>6.1 Tutorial Mengunduh Kode Sumber dari Repositori GitHub</w:t>
+      </w:r>
+    </w:p>
+    <w:p>
+      <w:r>
+        <w:t>Seluruh kode sumber terbaru, skrip pengujian UDP, pustaka skematik, serta dokumentasi sistem tersimpan secara terpusat pada repositori GitHub resmi tim pengabdian:</w:t>
+        <w:br/>
+        <w:t>🔗 URL Repositori: https://github.com/Novadriann/PKM---Margorejo</w:t>
+        <w:br/>
+        <w:br/>
+        <w:t>Terdapat dua metode untuk mengunduh kode program ke komputer kerja:</w:t>
+      </w:r>
+    </w:p>
+    <w:p>
+      <w:r>
+        <w:rPr>
+          <w:b/>
+        </w:rPr>
+        <w:t>Metode 1: Mengunduh File ZIP Langsung (Paling Mudah Tanpa Git)</w:t>
+        <w:br/>
+      </w:r>
+      <w:r>
+        <w:t>1. Buka tautan https://github.com/Novadriann/PKM---Margorejo melalui peramban web (Google Chrome / Firefox / Edge).</w:t>
+        <w:br/>
+        <w:t>2. Klik tombol hijau bertuliskan '&lt;&gt; Code' yang berada di bagian kanan atas daftar file.</w:t>
+        <w:br/>
+        <w:t>3. Pada menu dropdown yang muncul, pilih opsi 'Download ZIP'.</w:t>
+        <w:br/>
+        <w:t>4. Setelah proses unduhan selesai, klik kanan file ZIP tersebut lalu pilih 'Extract All...' (Ekstrak Semua) ke folder kerja di komputer (contoh: C:\PKM Margorejo\).</w:t>
+        <w:br/>
+        <w:t>5. Folder hasil ekstraksi siap dibuka langsung menggunakan Arduino IDE.</w:t>
+      </w:r>
+    </w:p>
+    <w:p>
+      <w:r>
+        <w:rPr>
+          <w:b/>
+        </w:rPr>
+        <w:t>Metode 2: Menggunakan Git Command Line (Untuk Programmer/Developer)</w:t>
+        <w:br/>
+      </w:r>
+      <w:r>
+        <w:t>Buka terminal Command Prompt (CMD) atau PowerShell, lalu jalankan perintah kloning berikut:</w:t>
+        <w:br/>
+        <w:t>git clone https://github.com/Novadriann/PKM---Margorejo.git</w:t>
+        <w:br/>
+        <w:t>Folder repositori akan otomatis terunduh lengkap dengan riwayat komit pengembangannya.</w:t>
+      </w:r>
+    </w:p>
+    <w:p>
+      <w:pPr>
+        <w:keepNext/>
+        <w:spacing w:before="240" w:after="80"/>
+      </w:pPr>
+      <w:r>
+        <w:rPr>
+          <w:rFonts w:ascii="Arial" w:hAnsi="Arial"/>
+          <w:b/>
+          <w:color w:val="2D6A4F"/>
+          <w:sz w:val="24"/>
+        </w:rPr>
+        <w:t>6.2 Struktur Direktori &amp; Fungsi Berkas Repositori</w:t>
+      </w:r>
+    </w:p>
+    <w:p>
+      <w:r>
+        <w:t>Berikut adalah peta struktur berkas kode program yang terdapat di dalam repositori:</w:t>
+      </w:r>
+    </w:p>
+    <w:tbl>
+      <w:tblPr>
+        <w:tblW w:type="auto" w:w="0"/>
+        <w:jc w:val="center"/>
+        <w:tblLayout w:type="fixed"/>
+        <w:tblLook w:firstColumn="1" w:firstRow="1" w:lastColumn="0" w:lastRow="0" w:noHBand="0" w:noVBand="1" w:val="04A0"/>
+      </w:tblPr>
+      <w:tblGrid>
+        <w:gridCol w:w="3120"/>
+        <w:gridCol w:w="3120"/>
+        <w:gridCol w:w="3120"/>
+      </w:tblGrid>
+      <w:tr>
+        <w:tc>
+          <w:tcPr>
+            <w:tcW w:type="dxa" w:w="3312"/>
+            <w:vAlign w:val="center"/>
+            <w:shd w:fill="245729"/>
+            <w:tcMar>
+              <w:top w:w="120" w:type="dxa"/>
+              <w:bottom w:w="120" w:type="dxa"/>
+              <w:left w:w="140" w:type="dxa"/>
+              <w:right w:w="140" w:type="dxa"/>
+            </w:tcMar>
+            <w:tcBorders>
+              <w:top w:val="single" w:sz="6" w:color="1E4620"/>
+              <w:bottom w:val="single" w:sz="12" w:color="1E4620"/>
+              <w:left w:val="single" w:sz="4" w:color="D1D5DB"/>
+              <w:right w:val="single" w:sz="4" w:color="D1D5DB"/>
+            </w:tcBorders>
+          </w:tcPr>
+          <w:p>
+            <w:pPr>
+              <w:spacing w:before="0" w:after="0"/>
+              <w:jc w:val="center"/>
+            </w:pPr>
+            <w:r>
+              <w:rPr>
+                <w:b/>
+                <w:color w:val="FFFFFF"/>
+                <w:sz w:val="19"/>
+              </w:rPr>
+              <w:t>Nama Berkas / Direktori</w:t>
+            </w:r>
+          </w:p>
+        </w:tc>
+        <w:tc>
+          <w:tcPr>
+            <w:tcW w:type="dxa" w:w="1728"/>
+            <w:vAlign w:val="center"/>
+            <w:shd w:fill="245729"/>
+            <w:tcMar>
+              <w:top w:w="120" w:type="dxa"/>
+              <w:bottom w:w="120" w:type="dxa"/>
+              <w:left w:w="140" w:type="dxa"/>
+              <w:right w:w="140" w:type="dxa"/>
+            </w:tcMar>
+            <w:tcBorders>
+              <w:top w:val="single" w:sz="6" w:color="1E4620"/>
+              <w:bottom w:val="single" w:sz="12" w:color="1E4620"/>
+              <w:left w:val="single" w:sz="4" w:color="D1D5DB"/>
+              <w:right w:val="single" w:sz="4" w:color="D1D5DB"/>
+            </w:tcBorders>
+          </w:tcPr>
+          <w:p>
+            <w:pPr>
+              <w:spacing w:before="0" w:after="0"/>
+              <w:jc w:val="center"/>
+            </w:pPr>
+            <w:r>
+              <w:rPr>
+                <w:b/>
+                <w:color w:val="FFFFFF"/>
+                <w:sz w:val="19"/>
+              </w:rPr>
+              <w:t>Kategori</w:t>
+            </w:r>
+          </w:p>
+        </w:tc>
+        <w:tc>
+          <w:tcPr>
+            <w:tcW w:type="dxa" w:w="4320"/>
+            <w:vAlign w:val="center"/>
+            <w:shd w:fill="245729"/>
+            <w:tcMar>
+              <w:top w:w="120" w:type="dxa"/>
+              <w:bottom w:w="120" w:type="dxa"/>
+              <w:left w:w="140" w:type="dxa"/>
+              <w:right w:w="140" w:type="dxa"/>
+            </w:tcMar>
+            <w:tcBorders>
+              <w:top w:val="single" w:sz="6" w:color="1E4620"/>
+              <w:bottom w:val="single" w:sz="12" w:color="1E4620"/>
+              <w:left w:val="single" w:sz="4" w:color="D1D5DB"/>
+              <w:right w:val="single" w:sz="4" w:color="D1D5DB"/>
+            </w:tcBorders>
+          </w:tcPr>
+          <w:p>
+            <w:pPr>
+              <w:spacing w:before="0" w:after="0"/>
+              <w:jc w:val="center"/>
+            </w:pPr>
+            <w:r>
+              <w:rPr>
+                <w:b/>
+                <w:color w:val="FFFFFF"/>
+                <w:sz w:val="19"/>
+              </w:rPr>
+              <w:t>Deskripsi &amp; Peran dalam Sistem</w:t>
+            </w:r>
+          </w:p>
+        </w:tc>
+      </w:tr>
+      <w:tr>
+        <w:tc>
+          <w:tcPr>
+            <w:tcW w:type="dxa" w:w="3312"/>
+            <w:vAlign w:val="center"/>
+            <w:shd w:fill="FFFFFF"/>
+            <w:tcMar>
+              <w:top w:w="90" w:type="dxa"/>
+              <w:bottom w:w="90" w:type="dxa"/>
+              <w:left w:w="140" w:type="dxa"/>
+              <w:right w:w="140" w:type="dxa"/>
+            </w:tcMar>
+            <w:tcBorders>
+              <w:top w:val="single" w:sz="4" w:color="D1D5DB"/>
+              <w:bottom w:val="single" w:sz="4" w:color="D1D5DB"/>
+              <w:left w:val="single" w:sz="4" w:color="D1D5DB"/>
+              <w:right w:val="single" w:sz="4" w:color="D1D5DB"/>
+            </w:tcBorders>
+          </w:tcPr>
+          <w:p>
+            <w:pPr>
+              <w:spacing w:before="0" w:after="0"/>
+              <w:jc w:val="center"/>
+            </w:pPr>
+            <w:r>
+              <w:rPr>
+                <w:color w:val="282828"/>
+                <w:sz w:val="18"/>
+              </w:rPr>
+              <w:t>KODE_ESP_NODE1_SEMOGASUDAHFIX/</w:t>
+            </w:r>
+          </w:p>
+        </w:tc>
+        <w:tc>
+          <w:tcPr>
+            <w:tcW w:type="dxa" w:w="1728"/>
+            <w:vAlign w:val="center"/>
+            <w:shd w:fill="FFFFFF"/>
+            <w:tcMar>
+              <w:top w:w="90" w:type="dxa"/>
+              <w:bottom w:w="90" w:type="dxa"/>
+              <w:left w:w="140" w:type="dxa"/>
+              <w:right w:w="140" w:type="dxa"/>
+            </w:tcMar>
+            <w:tcBorders>
+              <w:top w:val="single" w:sz="4" w:color="D1D5DB"/>
+              <w:bottom w:val="single" w:sz="4" w:color="D1D5DB"/>
+              <w:left w:val="single" w:sz="4" w:color="D1D5DB"/>
+              <w:right w:val="single" w:sz="4" w:color="D1D5DB"/>
+            </w:tcBorders>
+          </w:tcPr>
+          <w:p>
+            <w:pPr>
+              <w:spacing w:before="0" w:after="0"/>
+              <w:jc w:val="left"/>
+            </w:pPr>
+            <w:r>
+              <w:rPr>
+                <w:color w:val="282828"/>
+                <w:sz w:val="18"/>
+              </w:rPr>
+              <w:t>Firmware Node 1</w:t>
+            </w:r>
+          </w:p>
+        </w:tc>
+        <w:tc>
+          <w:tcPr>
+            <w:tcW w:type="dxa" w:w="4320"/>
+            <w:vAlign w:val="center"/>
+            <w:shd w:fill="FFFFFF"/>
+            <w:tcMar>
+              <w:top w:w="90" w:type="dxa"/>
+              <w:bottom w:w="90" w:type="dxa"/>
+              <w:left w:w="140" w:type="dxa"/>
+              <w:right w:w="140" w:type="dxa"/>
+            </w:tcMar>
+            <w:tcBorders>
+              <w:top w:val="single" w:sz="4" w:color="D1D5DB"/>
+              <w:bottom w:val="single" w:sz="4" w:color="D1D5DB"/>
+              <w:left w:val="single" w:sz="4" w:color="D1D5DB"/>
+              <w:right w:val="single" w:sz="4" w:color="D1D5DB"/>
+            </w:tcBorders>
+          </w:tcPr>
+          <w:p>
+            <w:pPr>
+              <w:spacing w:before="0" w:after="0"/>
+              <w:jc w:val="left"/>
+            </w:pPr>
+            <w:r>
+              <w:rPr>
+                <w:color w:val="282828"/>
+                <w:sz w:val="18"/>
+              </w:rPr>
+              <w:t>Kode Arduino IDE untuk Stasiun 1: Membaca NPK, RTC, mengontrol Solenoid Valve, Kipas, dan Lampu UV.</w:t>
+            </w:r>
+          </w:p>
+        </w:tc>
+      </w:tr>
+      <w:tr>
+        <w:tc>
+          <w:tcPr>
+            <w:tcW w:type="dxa" w:w="3312"/>
+            <w:vAlign w:val="center"/>
+            <w:shd w:fill="F9FDF9"/>
+            <w:tcMar>
+              <w:top w:w="90" w:type="dxa"/>
+              <w:bottom w:w="90" w:type="dxa"/>
+              <w:left w:w="140" w:type="dxa"/>
+              <w:right w:w="140" w:type="dxa"/>
+            </w:tcMar>
+            <w:tcBorders>
+              <w:top w:val="single" w:sz="4" w:color="D1D5DB"/>
+              <w:bottom w:val="single" w:sz="4" w:color="D1D5DB"/>
+              <w:left w:val="single" w:sz="4" w:color="D1D5DB"/>
+              <w:right w:val="single" w:sz="4" w:color="D1D5DB"/>
+            </w:tcBorders>
+          </w:tcPr>
+          <w:p>
+            <w:pPr>
+              <w:spacing w:before="0" w:after="0"/>
+              <w:jc w:val="center"/>
+            </w:pPr>
+            <w:r>
+              <w:rPr>
+                <w:color w:val="282828"/>
+                <w:sz w:val="18"/>
+              </w:rPr>
+              <w:t>KODE_ESP_NODE2_SEMOGASUDAHFIX/</w:t>
+            </w:r>
+          </w:p>
+        </w:tc>
+        <w:tc>
+          <w:tcPr>
+            <w:tcW w:type="dxa" w:w="1728"/>
+            <w:vAlign w:val="center"/>
+            <w:shd w:fill="F9FDF9"/>
+            <w:tcMar>
+              <w:top w:w="90" w:type="dxa"/>
+              <w:bottom w:w="90" w:type="dxa"/>
+              <w:left w:w="140" w:type="dxa"/>
+              <w:right w:w="140" w:type="dxa"/>
+            </w:tcMar>
+            <w:tcBorders>
+              <w:top w:val="single" w:sz="4" w:color="D1D5DB"/>
+              <w:bottom w:val="single" w:sz="4" w:color="D1D5DB"/>
+              <w:left w:val="single" w:sz="4" w:color="D1D5DB"/>
+              <w:right w:val="single" w:sz="4" w:color="D1D5DB"/>
+            </w:tcBorders>
+          </w:tcPr>
+          <w:p>
+            <w:pPr>
+              <w:spacing w:before="0" w:after="0"/>
+              <w:jc w:val="left"/>
+            </w:pPr>
+            <w:r>
+              <w:rPr>
+                <w:color w:val="282828"/>
+                <w:sz w:val="18"/>
+              </w:rPr>
+              <w:t>Firmware Node 2</w:t>
+            </w:r>
+          </w:p>
+        </w:tc>
+        <w:tc>
+          <w:tcPr>
+            <w:tcW w:type="dxa" w:w="4320"/>
+            <w:vAlign w:val="center"/>
+            <w:shd w:fill="F9FDF9"/>
+            <w:tcMar>
+              <w:top w:w="90" w:type="dxa"/>
+              <w:bottom w:w="90" w:type="dxa"/>
+              <w:left w:w="140" w:type="dxa"/>
+              <w:right w:w="140" w:type="dxa"/>
+            </w:tcMar>
+            <w:tcBorders>
+              <w:top w:val="single" w:sz="4" w:color="D1D5DB"/>
+              <w:bottom w:val="single" w:sz="4" w:color="D1D5DB"/>
+              <w:left w:val="single" w:sz="4" w:color="D1D5DB"/>
+              <w:right w:val="single" w:sz="4" w:color="D1D5DB"/>
+            </w:tcBorders>
+          </w:tcPr>
+          <w:p>
+            <w:pPr>
+              <w:spacing w:before="0" w:after="0"/>
+              <w:jc w:val="left"/>
+            </w:pPr>
+            <w:r>
+              <w:rPr>
+                <w:color w:val="282828"/>
+                <w:sz w:val="18"/>
+              </w:rPr>
+              <w:t>Kode Arduino IDE untuk Stasiun 2: Membaca NPK, pemantauan baterai INA226 (arus positif saat charging), dan Kipas.</w:t>
+            </w:r>
+          </w:p>
+        </w:tc>
+      </w:tr>
+      <w:tr>
+        <w:tc>
+          <w:tcPr>
+            <w:tcW w:type="dxa" w:w="3312"/>
+            <w:vAlign w:val="center"/>
+            <w:shd w:fill="FFFFFF"/>
+            <w:tcMar>
+              <w:top w:w="90" w:type="dxa"/>
+              <w:bottom w:w="90" w:type="dxa"/>
+              <w:left w:w="140" w:type="dxa"/>
+              <w:right w:w="140" w:type="dxa"/>
+            </w:tcMar>
+            <w:tcBorders>
+              <w:top w:val="single" w:sz="4" w:color="D1D5DB"/>
+              <w:bottom w:val="single" w:sz="4" w:color="D1D5DB"/>
+              <w:left w:val="single" w:sz="4" w:color="D1D5DB"/>
+              <w:right w:val="single" w:sz="4" w:color="D1D5DB"/>
+            </w:tcBorders>
+          </w:tcPr>
+          <w:p>
+            <w:pPr>
+              <w:spacing w:before="0" w:after="0"/>
+              <w:jc w:val="center"/>
+            </w:pPr>
+            <w:r>
+              <w:rPr>
+                <w:color w:val="282828"/>
+                <w:sz w:val="18"/>
+              </w:rPr>
+              <w:t>cek_udp.py</w:t>
+            </w:r>
+          </w:p>
+        </w:tc>
+        <w:tc>
+          <w:tcPr>
+            <w:tcW w:type="dxa" w:w="1728"/>
+            <w:vAlign w:val="center"/>
+            <w:shd w:fill="FFFFFF"/>
+            <w:tcMar>
+              <w:top w:w="90" w:type="dxa"/>
+              <w:bottom w:w="90" w:type="dxa"/>
+              <w:left w:w="140" w:type="dxa"/>
+              <w:right w:w="140" w:type="dxa"/>
+            </w:tcMar>
+            <w:tcBorders>
+              <w:top w:val="single" w:sz="4" w:color="D1D5DB"/>
+              <w:bottom w:val="single" w:sz="4" w:color="D1D5DB"/>
+              <w:left w:val="single" w:sz="4" w:color="D1D5DB"/>
+              <w:right w:val="single" w:sz="4" w:color="D1D5DB"/>
+            </w:tcBorders>
+          </w:tcPr>
+          <w:p>
+            <w:pPr>
+              <w:spacing w:before="0" w:after="0"/>
+              <w:jc w:val="left"/>
+            </w:pPr>
+            <w:r>
+              <w:rPr>
+                <w:color w:val="282828"/>
+                <w:sz w:val="18"/>
+              </w:rPr>
+              <w:t>Script Python</w:t>
+            </w:r>
+          </w:p>
+        </w:tc>
+        <w:tc>
+          <w:tcPr>
+            <w:tcW w:type="dxa" w:w="4320"/>
+            <w:vAlign w:val="center"/>
+            <w:shd w:fill="FFFFFF"/>
+            <w:tcMar>
+              <w:top w:w="90" w:type="dxa"/>
+              <w:bottom w:w="90" w:type="dxa"/>
+              <w:left w:w="140" w:type="dxa"/>
+              <w:right w:w="140" w:type="dxa"/>
+            </w:tcMar>
+            <w:tcBorders>
+              <w:top w:val="single" w:sz="4" w:color="D1D5DB"/>
+              <w:bottom w:val="single" w:sz="4" w:color="D1D5DB"/>
+              <w:left w:val="single" w:sz="4" w:color="D1D5DB"/>
+              <w:right w:val="single" w:sz="4" w:color="D1D5DB"/>
+            </w:tcBorders>
+          </w:tcPr>
+          <w:p>
+            <w:pPr>
+              <w:spacing w:before="0" w:after="0"/>
+              <w:jc w:val="left"/>
+            </w:pPr>
+            <w:r>
+              <w:rPr>
+                <w:color w:val="282828"/>
+                <w:sz w:val="18"/>
+              </w:rPr>
+              <w:t>Alat monitoring telemetri real-time di laptop teknisi tanpa butuh internet (menangkap siaran UDP port 4210).</w:t>
+            </w:r>
+          </w:p>
+        </w:tc>
+      </w:tr>
+      <w:tr>
+        <w:tc>
+          <w:tcPr>
+            <w:tcW w:type="dxa" w:w="3312"/>
+            <w:vAlign w:val="center"/>
+            <w:shd w:fill="F9FDF9"/>
+            <w:tcMar>
+              <w:top w:w="90" w:type="dxa"/>
+              <w:bottom w:w="90" w:type="dxa"/>
+              <w:left w:w="140" w:type="dxa"/>
+              <w:right w:w="140" w:type="dxa"/>
+            </w:tcMar>
+            <w:tcBorders>
+              <w:top w:val="single" w:sz="4" w:color="D1D5DB"/>
+              <w:bottom w:val="single" w:sz="4" w:color="D1D5DB"/>
+              <w:left w:val="single" w:sz="4" w:color="D1D5DB"/>
+              <w:right w:val="single" w:sz="4" w:color="D1D5DB"/>
+            </w:tcBorders>
+          </w:tcPr>
+          <w:p>
+            <w:pPr>
+              <w:spacing w:before="0" w:after="0"/>
+              <w:jc w:val="center"/>
+            </w:pPr>
+            <w:r>
+              <w:rPr>
+                <w:color w:val="282828"/>
+                <w:sz w:val="18"/>
+              </w:rPr>
+              <w:t>Buku_Panduan_Wiring_NURTURE_Margorejo.docx</w:t>
+            </w:r>
+          </w:p>
+        </w:tc>
+        <w:tc>
+          <w:tcPr>
+            <w:tcW w:type="dxa" w:w="1728"/>
+            <w:vAlign w:val="center"/>
+            <w:shd w:fill="F9FDF9"/>
+            <w:tcMar>
+              <w:top w:w="90" w:type="dxa"/>
+              <w:bottom w:w="90" w:type="dxa"/>
+              <w:left w:w="140" w:type="dxa"/>
+              <w:right w:w="140" w:type="dxa"/>
+            </w:tcMar>
+            <w:tcBorders>
+              <w:top w:val="single" w:sz="4" w:color="D1D5DB"/>
+              <w:bottom w:val="single" w:sz="4" w:color="D1D5DB"/>
+              <w:left w:val="single" w:sz="4" w:color="D1D5DB"/>
+              <w:right w:val="single" w:sz="4" w:color="D1D5DB"/>
+            </w:tcBorders>
+          </w:tcPr>
+          <w:p>
+            <w:pPr>
+              <w:spacing w:before="0" w:after="0"/>
+              <w:jc w:val="left"/>
+            </w:pPr>
+            <w:r>
+              <w:rPr>
+                <w:color w:val="282828"/>
+                <w:sz w:val="18"/>
+              </w:rPr>
+              <w:t>Dokumentasi</w:t>
+            </w:r>
+          </w:p>
+        </w:tc>
+        <w:tc>
+          <w:tcPr>
+            <w:tcW w:type="dxa" w:w="4320"/>
+            <w:vAlign w:val="center"/>
+            <w:shd w:fill="F9FDF9"/>
+            <w:tcMar>
+              <w:top w:w="90" w:type="dxa"/>
+              <w:bottom w:w="90" w:type="dxa"/>
+              <w:left w:w="140" w:type="dxa"/>
+              <w:right w:w="140" w:type="dxa"/>
+            </w:tcMar>
+            <w:tcBorders>
+              <w:top w:val="single" w:sz="4" w:color="D1D5DB"/>
+              <w:bottom w:val="single" w:sz="4" w:color="D1D5DB"/>
+              <w:left w:val="single" w:sz="4" w:color="D1D5DB"/>
+              <w:right w:val="single" w:sz="4" w:color="D1D5DB"/>
+            </w:tcBorders>
+          </w:tcPr>
+          <w:p>
+            <w:pPr>
+              <w:spacing w:before="0" w:after="0"/>
+              <w:jc w:val="left"/>
+            </w:pPr>
+            <w:r>
+              <w:rPr>
+                <w:color w:val="282828"/>
+                <w:sz w:val="18"/>
+              </w:rPr>
+              <w:t>Buku panduan teknis dan wiring lengkap untuk petani dan teknisi lapangan.</w:t>
+            </w:r>
+          </w:p>
+        </w:tc>
+      </w:tr>
+      <w:tr>
+        <w:tc>
+          <w:tcPr>
+            <w:tcW w:type="dxa" w:w="3312"/>
+            <w:vAlign w:val="center"/>
+            <w:shd w:fill="FFFFFF"/>
+            <w:tcMar>
+              <w:top w:w="90" w:type="dxa"/>
+              <w:bottom w:w="90" w:type="dxa"/>
+              <w:left w:w="140" w:type="dxa"/>
+              <w:right w:w="140" w:type="dxa"/>
+            </w:tcMar>
+            <w:tcBorders>
+              <w:top w:val="single" w:sz="4" w:color="D1D5DB"/>
+              <w:bottom w:val="single" w:sz="4" w:color="D1D5DB"/>
+              <w:left w:val="single" w:sz="4" w:color="D1D5DB"/>
+              <w:right w:val="single" w:sz="4" w:color="D1D5DB"/>
+            </w:tcBorders>
+          </w:tcPr>
+          <w:p>
+            <w:pPr>
+              <w:spacing w:before="0" w:after="0"/>
+              <w:jc w:val="center"/>
+            </w:pPr>
+            <w:r>
+              <w:rPr>
+                <w:color w:val="282828"/>
+                <w:sz w:val="18"/>
+              </w:rPr>
+              <w:t>save_data.py &amp; platformio.ini</w:t>
+            </w:r>
+          </w:p>
+        </w:tc>
+        <w:tc>
+          <w:tcPr>
+            <w:tcW w:type="dxa" w:w="1728"/>
+            <w:vAlign w:val="center"/>
+            <w:shd w:fill="FFFFFF"/>
+            <w:tcMar>
+              <w:top w:w="90" w:type="dxa"/>
+              <w:bottom w:w="90" w:type="dxa"/>
+              <w:left w:w="140" w:type="dxa"/>
+              <w:right w:w="140" w:type="dxa"/>
+            </w:tcMar>
+            <w:tcBorders>
+              <w:top w:val="single" w:sz="4" w:color="D1D5DB"/>
+              <w:bottom w:val="single" w:sz="4" w:color="D1D5DB"/>
+              <w:left w:val="single" w:sz="4" w:color="D1D5DB"/>
+              <w:right w:val="single" w:sz="4" w:color="D1D5DB"/>
+            </w:tcBorders>
+          </w:tcPr>
+          <w:p>
+            <w:pPr>
+              <w:spacing w:before="0" w:after="0"/>
+              <w:jc w:val="left"/>
+            </w:pPr>
+            <w:r>
+              <w:rPr>
+                <w:color w:val="282828"/>
+                <w:sz w:val="18"/>
+              </w:rPr>
+              <w:t>Tooling</w:t>
+            </w:r>
+          </w:p>
+        </w:tc>
+        <w:tc>
+          <w:tcPr>
+            <w:tcW w:type="dxa" w:w="4320"/>
+            <w:vAlign w:val="center"/>
+            <w:shd w:fill="FFFFFF"/>
+            <w:tcMar>
+              <w:top w:w="90" w:type="dxa"/>
+              <w:bottom w:w="90" w:type="dxa"/>
+              <w:left w:w="140" w:type="dxa"/>
+              <w:right w:w="140" w:type="dxa"/>
+            </w:tcMar>
+            <w:tcBorders>
+              <w:top w:val="single" w:sz="4" w:color="D1D5DB"/>
+              <w:bottom w:val="single" w:sz="4" w:color="D1D5DB"/>
+              <w:left w:val="single" w:sz="4" w:color="D1D5DB"/>
+              <w:right w:val="single" w:sz="4" w:color="D1D5DB"/>
+            </w:tcBorders>
+          </w:tcPr>
+          <w:p>
+            <w:pPr>
+              <w:spacing w:before="0" w:after="0"/>
+              <w:jc w:val="left"/>
+            </w:pPr>
+            <w:r>
+              <w:rPr>
+                <w:color w:val="282828"/>
+                <w:sz w:val="18"/>
+              </w:rPr>
+              <w:t>Konfigurasi pendukung PlatformIO dan penyimpanan log telemetri.</w:t>
+            </w:r>
+          </w:p>
+        </w:tc>
+      </w:tr>
+    </w:tbl>
+    <w:p>
+      <w:pPr>
+        <w:spacing w:before="0" w:after="120"/>
+      </w:pPr>
+    </w:p>
+    <w:p>
+      <w:pPr>
+        <w:keepNext/>
+        <w:spacing w:before="240" w:after="80"/>
+      </w:pPr>
+      <w:r>
+        <w:rPr>
+          <w:rFonts w:ascii="Arial" w:hAnsi="Arial"/>
+          <w:b/>
+          <w:color w:val="2D6A4F"/>
+          <w:sz w:val="24"/>
+        </w:rPr>
+        <w:t>6.3 Konfigurasi Board ESP32-S3 pada Arduino IDE</w:t>
+      </w:r>
+    </w:p>
+    <w:p>
+      <w:r>
+        <w:t>Sebelum mengunggah kode, pastikan Arduino IDE telah terpasang board support 'esp32 by Espressif Systems' dan pustaka (library) yang dibutuhkan telah diinstal melalui menu Tools -&gt; Manage Libraries:</w:t>
+        <w:br/>
+        <w:t>• RTClib (oleh Adafruit): Pengelolaan kalender dan waktu presisi modul DS3231 via I2C.</w:t>
+        <w:br/>
+        <w:t>• DHT sensor library (oleh Adafruit): Pembacaan suhu dan kelembapan sensor DHT22.</w:t>
+        <w:br/>
+        <w:t>• ModbusMaster (oleh Doc Walker / 4-20ma): Penanganan protokol Modbus RTU RS485 sensor NPK.</w:t>
+        <w:br/>
+        <w:t>• INA226_WE (oleh Wolfgang Ewald): Pembacaan presisi arus, tegangan, dan daya PLTS via I2C.</w:t>
+        <w:br/>
+        <w:br/>
+        <w:t>Pengaturan Board Menu 'Tools' pada Arduino IDE wajib disesuaikan sebagai berikut:</w:t>
+      </w:r>
+    </w:p>
+    <w:tbl>
+      <w:tblPr>
+        <w:tblW w:type="auto" w:w="0"/>
+        <w:jc w:val="center"/>
+        <w:tblLayout w:type="fixed"/>
+        <w:tblLook w:firstColumn="1" w:firstRow="1" w:lastColumn="0" w:lastRow="0" w:noHBand="0" w:noVBand="1" w:val="04A0"/>
+      </w:tblPr>
+      <w:tblGrid>
+        <w:gridCol w:w="3120"/>
+        <w:gridCol w:w="3120"/>
+        <w:gridCol w:w="3120"/>
+      </w:tblGrid>
+      <w:tr>
+        <w:tc>
+          <w:tcPr>
+            <w:tcW w:type="dxa" w:w="2592"/>
+            <w:vAlign w:val="center"/>
+            <w:shd w:fill="245729"/>
+            <w:tcMar>
+              <w:top w:w="120" w:type="dxa"/>
+              <w:bottom w:w="120" w:type="dxa"/>
+              <w:left w:w="140" w:type="dxa"/>
+              <w:right w:w="140" w:type="dxa"/>
+            </w:tcMar>
+            <w:tcBorders>
+              <w:top w:val="single" w:sz="6" w:color="1E4620"/>
+              <w:bottom w:val="single" w:sz="12" w:color="1E4620"/>
+              <w:left w:val="single" w:sz="4" w:color="D1D5DB"/>
+              <w:right w:val="single" w:sz="4" w:color="D1D5DB"/>
+            </w:tcBorders>
+          </w:tcPr>
+          <w:p>
+            <w:pPr>
+              <w:spacing w:before="0" w:after="0"/>
+              <w:jc w:val="center"/>
+            </w:pPr>
+            <w:r>
+              <w:rPr>
+                <w:b/>
+                <w:color w:val="FFFFFF"/>
+                <w:sz w:val="19"/>
+              </w:rPr>
+              <w:t>Parameter Pengaturan (Tools)</w:t>
+            </w:r>
+          </w:p>
+        </w:tc>
+        <w:tc>
+          <w:tcPr>
+            <w:tcW w:type="dxa" w:w="2880"/>
+            <w:vAlign w:val="center"/>
+            <w:shd w:fill="245729"/>
+            <w:tcMar>
+              <w:top w:w="120" w:type="dxa"/>
+              <w:bottom w:w="120" w:type="dxa"/>
+              <w:left w:w="140" w:type="dxa"/>
+              <w:right w:w="140" w:type="dxa"/>
+            </w:tcMar>
+            <w:tcBorders>
+              <w:top w:val="single" w:sz="6" w:color="1E4620"/>
+              <w:bottom w:val="single" w:sz="12" w:color="1E4620"/>
+              <w:left w:val="single" w:sz="4" w:color="D1D5DB"/>
+              <w:right w:val="single" w:sz="4" w:color="D1D5DB"/>
+            </w:tcBorders>
+          </w:tcPr>
+          <w:p>
+            <w:pPr>
+              <w:spacing w:before="0" w:after="0"/>
+              <w:jc w:val="center"/>
+            </w:pPr>
+            <w:r>
+              <w:rPr>
+                <w:b/>
+                <w:color w:val="FFFFFF"/>
+                <w:sz w:val="19"/>
+              </w:rPr>
+              <w:t>Nilai Pilihan (Configuration)</w:t>
+            </w:r>
+          </w:p>
+        </w:tc>
+        <w:tc>
+          <w:tcPr>
+            <w:tcW w:type="dxa" w:w="3888"/>
+            <w:vAlign w:val="center"/>
+            <w:shd w:fill="245729"/>
+            <w:tcMar>
+              <w:top w:w="120" w:type="dxa"/>
+              <w:bottom w:w="120" w:type="dxa"/>
+              <w:left w:w="140" w:type="dxa"/>
+              <w:right w:w="140" w:type="dxa"/>
+            </w:tcMar>
+            <w:tcBorders>
+              <w:top w:val="single" w:sz="6" w:color="1E4620"/>
+              <w:bottom w:val="single" w:sz="12" w:color="1E4620"/>
+              <w:left w:val="single" w:sz="4" w:color="D1D5DB"/>
+              <w:right w:val="single" w:sz="4" w:color="D1D5DB"/>
+            </w:tcBorders>
+          </w:tcPr>
+          <w:p>
+            <w:pPr>
+              <w:spacing w:before="0" w:after="0"/>
+              <w:jc w:val="center"/>
+            </w:pPr>
+            <w:r>
+              <w:rPr>
+                <w:b/>
+                <w:color w:val="FFFFFF"/>
+                <w:sz w:val="19"/>
+              </w:rPr>
+              <w:t>Fungsi &amp; Alasan Teknis</w:t>
+            </w:r>
+          </w:p>
+        </w:tc>
+      </w:tr>
+      <w:tr>
+        <w:tc>
+          <w:tcPr>
+            <w:tcW w:type="dxa" w:w="2592"/>
+            <w:vAlign w:val="center"/>
+            <w:shd w:fill="FFFFFF"/>
+            <w:tcMar>
+              <w:top w:w="90" w:type="dxa"/>
+              <w:bottom w:w="90" w:type="dxa"/>
+              <w:left w:w="140" w:type="dxa"/>
+              <w:right w:w="140" w:type="dxa"/>
+            </w:tcMar>
+            <w:tcBorders>
+              <w:top w:val="single" w:sz="4" w:color="D1D5DB"/>
+              <w:bottom w:val="single" w:sz="4" w:color="D1D5DB"/>
+              <w:left w:val="single" w:sz="4" w:color="D1D5DB"/>
+              <w:right w:val="single" w:sz="4" w:color="D1D5DB"/>
+            </w:tcBorders>
+          </w:tcPr>
+          <w:p>
+            <w:pPr>
+              <w:spacing w:before="0" w:after="0"/>
+              <w:jc w:val="center"/>
+            </w:pPr>
+            <w:r>
+              <w:rPr>
+                <w:color w:val="282828"/>
+                <w:sz w:val="18"/>
+              </w:rPr>
+              <w:t>Board</w:t>
+            </w:r>
+          </w:p>
+        </w:tc>
+        <w:tc>
+          <w:tcPr>
+            <w:tcW w:type="dxa" w:w="2880"/>
+            <w:vAlign w:val="center"/>
+            <w:shd w:fill="FFFFFF"/>
+            <w:tcMar>
+              <w:top w:w="90" w:type="dxa"/>
+              <w:bottom w:w="90" w:type="dxa"/>
+              <w:left w:w="140" w:type="dxa"/>
+              <w:right w:w="140" w:type="dxa"/>
+            </w:tcMar>
+            <w:tcBorders>
+              <w:top w:val="single" w:sz="4" w:color="D1D5DB"/>
+              <w:bottom w:val="single" w:sz="4" w:color="D1D5DB"/>
+              <w:left w:val="single" w:sz="4" w:color="D1D5DB"/>
+              <w:right w:val="single" w:sz="4" w:color="D1D5DB"/>
+            </w:tcBorders>
+          </w:tcPr>
+          <w:p>
+            <w:pPr>
+              <w:spacing w:before="0" w:after="0"/>
+              <w:jc w:val="left"/>
+            </w:pPr>
+            <w:r>
+              <w:rPr>
+                <w:color w:val="282828"/>
+                <w:sz w:val="18"/>
+              </w:rPr>
+              <w:t>ESP32S3 Dev Module</w:t>
+            </w:r>
+          </w:p>
+        </w:tc>
+        <w:tc>
+          <w:tcPr>
+            <w:tcW w:type="dxa" w:w="3888"/>
+            <w:vAlign w:val="center"/>
+            <w:shd w:fill="FFFFFF"/>
+            <w:tcMar>
+              <w:top w:w="90" w:type="dxa"/>
+              <w:bottom w:w="90" w:type="dxa"/>
+              <w:left w:w="140" w:type="dxa"/>
+              <w:right w:w="140" w:type="dxa"/>
+            </w:tcMar>
+            <w:tcBorders>
+              <w:top w:val="single" w:sz="4" w:color="D1D5DB"/>
+              <w:bottom w:val="single" w:sz="4" w:color="D1D5DB"/>
+              <w:left w:val="single" w:sz="4" w:color="D1D5DB"/>
+              <w:right w:val="single" w:sz="4" w:color="D1D5DB"/>
+            </w:tcBorders>
+          </w:tcPr>
+          <w:p>
+            <w:pPr>
+              <w:spacing w:before="0" w:after="0"/>
+              <w:jc w:val="left"/>
+            </w:pPr>
+            <w:r>
+              <w:rPr>
+                <w:color w:val="282828"/>
+                <w:sz w:val="18"/>
+              </w:rPr>
+              <w:t>Target chip mikrokontroler ESP32-S3 dual-core.</w:t>
+            </w:r>
+          </w:p>
+        </w:tc>
+      </w:tr>
+      <w:tr>
+        <w:tc>
+          <w:tcPr>
+            <w:tcW w:type="dxa" w:w="2592"/>
+            <w:vAlign w:val="center"/>
+            <w:shd w:fill="F9FDF9"/>
+            <w:tcMar>
+              <w:top w:w="90" w:type="dxa"/>
+              <w:bottom w:w="90" w:type="dxa"/>
+              <w:left w:w="140" w:type="dxa"/>
+              <w:right w:w="140" w:type="dxa"/>
+            </w:tcMar>
+            <w:tcBorders>
+              <w:top w:val="single" w:sz="4" w:color="D1D5DB"/>
+              <w:bottom w:val="single" w:sz="4" w:color="D1D5DB"/>
+              <w:left w:val="single" w:sz="4" w:color="D1D5DB"/>
+              <w:right w:val="single" w:sz="4" w:color="D1D5DB"/>
+            </w:tcBorders>
+          </w:tcPr>
+          <w:p>
+            <w:pPr>
+              <w:spacing w:before="0" w:after="0"/>
+              <w:jc w:val="center"/>
+            </w:pPr>
+            <w:r>
+              <w:rPr>
+                <w:color w:val="282828"/>
+                <w:sz w:val="18"/>
+              </w:rPr>
+              <w:t>USB CDC On Boot</w:t>
+            </w:r>
+          </w:p>
+        </w:tc>
+        <w:tc>
+          <w:tcPr>
+            <w:tcW w:type="dxa" w:w="2880"/>
+            <w:vAlign w:val="center"/>
+            <w:shd w:fill="F9FDF9"/>
+            <w:tcMar>
+              <w:top w:w="90" w:type="dxa"/>
+              <w:bottom w:w="90" w:type="dxa"/>
+              <w:left w:w="140" w:type="dxa"/>
+              <w:right w:w="140" w:type="dxa"/>
+            </w:tcMar>
+            <w:tcBorders>
+              <w:top w:val="single" w:sz="4" w:color="D1D5DB"/>
+              <w:bottom w:val="single" w:sz="4" w:color="D1D5DB"/>
+              <w:left w:val="single" w:sz="4" w:color="D1D5DB"/>
+              <w:right w:val="single" w:sz="4" w:color="D1D5DB"/>
+            </w:tcBorders>
+          </w:tcPr>
+          <w:p>
+            <w:pPr>
+              <w:spacing w:before="0" w:after="0"/>
+              <w:jc w:val="left"/>
+            </w:pPr>
+            <w:r>
+              <w:rPr>
+                <w:color w:val="282828"/>
+                <w:sz w:val="18"/>
+              </w:rPr>
+              <w:t>Enabled</w:t>
+            </w:r>
+          </w:p>
+        </w:tc>
+        <w:tc>
+          <w:tcPr>
+            <w:tcW w:type="dxa" w:w="3888"/>
+            <w:vAlign w:val="center"/>
+            <w:shd w:fill="F9FDF9"/>
+            <w:tcMar>
+              <w:top w:w="90" w:type="dxa"/>
+              <w:bottom w:w="90" w:type="dxa"/>
+              <w:left w:w="140" w:type="dxa"/>
+              <w:right w:w="140" w:type="dxa"/>
+            </w:tcMar>
+            <w:tcBorders>
+              <w:top w:val="single" w:sz="4" w:color="D1D5DB"/>
+              <w:bottom w:val="single" w:sz="4" w:color="D1D5DB"/>
+              <w:left w:val="single" w:sz="4" w:color="D1D5DB"/>
+              <w:right w:val="single" w:sz="4" w:color="D1D5DB"/>
+            </w:tcBorders>
+          </w:tcPr>
+          <w:p>
+            <w:pPr>
+              <w:spacing w:before="0" w:after="0"/>
+              <w:jc w:val="left"/>
+            </w:pPr>
+            <w:r>
+              <w:rPr>
+                <w:color w:val="282828"/>
+                <w:sz w:val="18"/>
+              </w:rPr>
+              <w:t>Mengaktifkan Serial Monitor langsung melalui port USB Type-C bawaan.</w:t>
+            </w:r>
+          </w:p>
+        </w:tc>
+      </w:tr>
+      <w:tr>
+        <w:tc>
+          <w:tcPr>
+            <w:tcW w:type="dxa" w:w="2592"/>
+            <w:vAlign w:val="center"/>
+            <w:shd w:fill="FFFFFF"/>
+            <w:tcMar>
+              <w:top w:w="90" w:type="dxa"/>
+              <w:bottom w:w="90" w:type="dxa"/>
+              <w:left w:w="140" w:type="dxa"/>
+              <w:right w:w="140" w:type="dxa"/>
+            </w:tcMar>
+            <w:tcBorders>
+              <w:top w:val="single" w:sz="4" w:color="D1D5DB"/>
+              <w:bottom w:val="single" w:sz="4" w:color="D1D5DB"/>
+              <w:left w:val="single" w:sz="4" w:color="D1D5DB"/>
+              <w:right w:val="single" w:sz="4" w:color="D1D5DB"/>
+            </w:tcBorders>
+          </w:tcPr>
+          <w:p>
+            <w:pPr>
+              <w:spacing w:before="0" w:after="0"/>
+              <w:jc w:val="center"/>
+            </w:pPr>
+            <w:r>
+              <w:rPr>
+                <w:color w:val="282828"/>
+                <w:sz w:val="18"/>
+              </w:rPr>
+              <w:t>Flash Size</w:t>
+            </w:r>
+          </w:p>
+        </w:tc>
+        <w:tc>
+          <w:tcPr>
+            <w:tcW w:type="dxa" w:w="2880"/>
+            <w:vAlign w:val="center"/>
+            <w:shd w:fill="FFFFFF"/>
+            <w:tcMar>
+              <w:top w:w="90" w:type="dxa"/>
+              <w:bottom w:w="90" w:type="dxa"/>
+              <w:left w:w="140" w:type="dxa"/>
+              <w:right w:w="140" w:type="dxa"/>
+            </w:tcMar>
+            <w:tcBorders>
+              <w:top w:val="single" w:sz="4" w:color="D1D5DB"/>
+              <w:bottom w:val="single" w:sz="4" w:color="D1D5DB"/>
+              <w:left w:val="single" w:sz="4" w:color="D1D5DB"/>
+              <w:right w:val="single" w:sz="4" w:color="D1D5DB"/>
+            </w:tcBorders>
+          </w:tcPr>
+          <w:p>
+            <w:pPr>
+              <w:spacing w:before="0" w:after="0"/>
+              <w:jc w:val="left"/>
+            </w:pPr>
+            <w:r>
+              <w:rPr>
+                <w:color w:val="282828"/>
+                <w:sz w:val="18"/>
+              </w:rPr>
+              <w:t>16MB (128Mb)</w:t>
+            </w:r>
+          </w:p>
+        </w:tc>
+        <w:tc>
+          <w:tcPr>
+            <w:tcW w:type="dxa" w:w="3888"/>
+            <w:vAlign w:val="center"/>
+            <w:shd w:fill="FFFFFF"/>
+            <w:tcMar>
+              <w:top w:w="90" w:type="dxa"/>
+              <w:bottom w:w="90" w:type="dxa"/>
+              <w:left w:w="140" w:type="dxa"/>
+              <w:right w:w="140" w:type="dxa"/>
+            </w:tcMar>
+            <w:tcBorders>
+              <w:top w:val="single" w:sz="4" w:color="D1D5DB"/>
+              <w:bottom w:val="single" w:sz="4" w:color="D1D5DB"/>
+              <w:left w:val="single" w:sz="4" w:color="D1D5DB"/>
+              <w:right w:val="single" w:sz="4" w:color="D1D5DB"/>
+            </w:tcBorders>
+          </w:tcPr>
+          <w:p>
+            <w:pPr>
+              <w:spacing w:before="0" w:after="0"/>
+              <w:jc w:val="left"/>
+            </w:pPr>
+            <w:r>
+              <w:rPr>
+                <w:color w:val="282828"/>
+                <w:sz w:val="18"/>
+              </w:rPr>
+              <w:t>Sesuai kapasitas memori flash fisik modul N16R8V.</w:t>
+            </w:r>
+          </w:p>
+        </w:tc>
+      </w:tr>
+      <w:tr>
+        <w:tc>
+          <w:tcPr>
+            <w:tcW w:type="dxa" w:w="2592"/>
+            <w:vAlign w:val="center"/>
+            <w:shd w:fill="F9FDF9"/>
+            <w:tcMar>
+              <w:top w:w="90" w:type="dxa"/>
+              <w:bottom w:w="90" w:type="dxa"/>
+              <w:left w:w="140" w:type="dxa"/>
+              <w:right w:w="140" w:type="dxa"/>
+            </w:tcMar>
+            <w:tcBorders>
+              <w:top w:val="single" w:sz="4" w:color="D1D5DB"/>
+              <w:bottom w:val="single" w:sz="4" w:color="D1D5DB"/>
+              <w:left w:val="single" w:sz="4" w:color="D1D5DB"/>
+              <w:right w:val="single" w:sz="4" w:color="D1D5DB"/>
+            </w:tcBorders>
+          </w:tcPr>
+          <w:p>
+            <w:pPr>
+              <w:spacing w:before="0" w:after="0"/>
+              <w:jc w:val="center"/>
+            </w:pPr>
+            <w:r>
+              <w:rPr>
+                <w:color w:val="282828"/>
+                <w:sz w:val="18"/>
+              </w:rPr>
+              <w:t>Partition Scheme</w:t>
+            </w:r>
+          </w:p>
+        </w:tc>
+        <w:tc>
+          <w:tcPr>
+            <w:tcW w:type="dxa" w:w="2880"/>
+            <w:vAlign w:val="center"/>
+            <w:shd w:fill="F9FDF9"/>
+            <w:tcMar>
+              <w:top w:w="90" w:type="dxa"/>
+              <w:bottom w:w="90" w:type="dxa"/>
+              <w:left w:w="140" w:type="dxa"/>
+              <w:right w:w="140" w:type="dxa"/>
+            </w:tcMar>
+            <w:tcBorders>
+              <w:top w:val="single" w:sz="4" w:color="D1D5DB"/>
+              <w:bottom w:val="single" w:sz="4" w:color="D1D5DB"/>
+              <w:left w:val="single" w:sz="4" w:color="D1D5DB"/>
+              <w:right w:val="single" w:sz="4" w:color="D1D5DB"/>
+            </w:tcBorders>
+          </w:tcPr>
+          <w:p>
+            <w:pPr>
+              <w:spacing w:before="0" w:after="0"/>
+              <w:jc w:val="left"/>
+            </w:pPr>
+            <w:r>
+              <w:rPr>
+                <w:color w:val="282828"/>
+                <w:sz w:val="18"/>
+              </w:rPr>
+              <w:t>16M Flash (3MB APP/9.9MB FATFS)</w:t>
+            </w:r>
+          </w:p>
+        </w:tc>
+        <w:tc>
+          <w:tcPr>
+            <w:tcW w:type="dxa" w:w="3888"/>
+            <w:vAlign w:val="center"/>
+            <w:shd w:fill="F9FDF9"/>
+            <w:tcMar>
+              <w:top w:w="90" w:type="dxa"/>
+              <w:bottom w:w="90" w:type="dxa"/>
+              <w:left w:w="140" w:type="dxa"/>
+              <w:right w:w="140" w:type="dxa"/>
+            </w:tcMar>
+            <w:tcBorders>
+              <w:top w:val="single" w:sz="4" w:color="D1D5DB"/>
+              <w:bottom w:val="single" w:sz="4" w:color="D1D5DB"/>
+              <w:left w:val="single" w:sz="4" w:color="D1D5DB"/>
+              <w:right w:val="single" w:sz="4" w:color="D1D5DB"/>
+            </w:tcBorders>
+          </w:tcPr>
+          <w:p>
+            <w:pPr>
+              <w:spacing w:before="0" w:after="0"/>
+              <w:jc w:val="left"/>
+            </w:pPr>
+            <w:r>
+              <w:rPr>
+                <w:color w:val="282828"/>
+                <w:sz w:val="18"/>
+              </w:rPr>
+              <w:t>Menyediakan ruang alokasi binary program dan sistem file yang besar.</w:t>
+            </w:r>
+          </w:p>
+        </w:tc>
+      </w:tr>
+      <w:tr>
+        <w:tc>
+          <w:tcPr>
+            <w:tcW w:type="dxa" w:w="2592"/>
+            <w:vAlign w:val="center"/>
+            <w:shd w:fill="FFFFFF"/>
+            <w:tcMar>
+              <w:top w:w="90" w:type="dxa"/>
+              <w:bottom w:w="90" w:type="dxa"/>
+              <w:left w:w="140" w:type="dxa"/>
+              <w:right w:w="140" w:type="dxa"/>
+            </w:tcMar>
+            <w:tcBorders>
+              <w:top w:val="single" w:sz="4" w:color="D1D5DB"/>
+              <w:bottom w:val="single" w:sz="4" w:color="D1D5DB"/>
+              <w:left w:val="single" w:sz="4" w:color="D1D5DB"/>
+              <w:right w:val="single" w:sz="4" w:color="D1D5DB"/>
+            </w:tcBorders>
+          </w:tcPr>
+          <w:p>
+            <w:pPr>
+              <w:spacing w:before="0" w:after="0"/>
+              <w:jc w:val="center"/>
+            </w:pPr>
+            <w:r>
+              <w:rPr>
+                <w:color w:val="282828"/>
+                <w:sz w:val="18"/>
+              </w:rPr>
+              <w:t>PSRAM</w:t>
+            </w:r>
+          </w:p>
+        </w:tc>
+        <w:tc>
+          <w:tcPr>
+            <w:tcW w:type="dxa" w:w="2880"/>
+            <w:vAlign w:val="center"/>
+            <w:shd w:fill="FFFFFF"/>
+            <w:tcMar>
+              <w:top w:w="90" w:type="dxa"/>
+              <w:bottom w:w="90" w:type="dxa"/>
+              <w:left w:w="140" w:type="dxa"/>
+              <w:right w:w="140" w:type="dxa"/>
+            </w:tcMar>
+            <w:tcBorders>
+              <w:top w:val="single" w:sz="4" w:color="D1D5DB"/>
+              <w:bottom w:val="single" w:sz="4" w:color="D1D5DB"/>
+              <w:left w:val="single" w:sz="4" w:color="D1D5DB"/>
+              <w:right w:val="single" w:sz="4" w:color="D1D5DB"/>
+            </w:tcBorders>
+          </w:tcPr>
+          <w:p>
+            <w:pPr>
+              <w:spacing w:before="0" w:after="0"/>
+              <w:jc w:val="left"/>
+            </w:pPr>
+            <w:r>
+              <w:rPr>
+                <w:color w:val="282828"/>
+                <w:sz w:val="18"/>
+              </w:rPr>
+              <w:t>OPI PSRAM</w:t>
+            </w:r>
+          </w:p>
+        </w:tc>
+        <w:tc>
+          <w:tcPr>
+            <w:tcW w:type="dxa" w:w="3888"/>
+            <w:vAlign w:val="center"/>
+            <w:shd w:fill="FFFFFF"/>
+            <w:tcMar>
+              <w:top w:w="90" w:type="dxa"/>
+              <w:bottom w:w="90" w:type="dxa"/>
+              <w:left w:w="140" w:type="dxa"/>
+              <w:right w:w="140" w:type="dxa"/>
+            </w:tcMar>
+            <w:tcBorders>
+              <w:top w:val="single" w:sz="4" w:color="D1D5DB"/>
+              <w:bottom w:val="single" w:sz="4" w:color="D1D5DB"/>
+              <w:left w:val="single" w:sz="4" w:color="D1D5DB"/>
+              <w:right w:val="single" w:sz="4" w:color="D1D5DB"/>
+            </w:tcBorders>
+          </w:tcPr>
+          <w:p>
+            <w:pPr>
+              <w:spacing w:before="0" w:after="0"/>
+              <w:jc w:val="left"/>
+            </w:pPr>
+            <w:r>
+              <w:rPr>
+                <w:color w:val="282828"/>
+                <w:sz w:val="18"/>
+              </w:rPr>
+              <w:t>Mengaktifkan memori eksternal 8MB PSRAM tipe Octal.</w:t>
+            </w:r>
+          </w:p>
+        </w:tc>
+      </w:tr>
+      <w:tr>
+        <w:tc>
+          <w:tcPr>
+            <w:tcW w:type="dxa" w:w="2592"/>
+            <w:vAlign w:val="center"/>
+            <w:shd w:fill="F9FDF9"/>
+            <w:tcMar>
+              <w:top w:w="90" w:type="dxa"/>
+              <w:bottom w:w="90" w:type="dxa"/>
+              <w:left w:w="140" w:type="dxa"/>
+              <w:right w:w="140" w:type="dxa"/>
+            </w:tcMar>
+            <w:tcBorders>
+              <w:top w:val="single" w:sz="4" w:color="D1D5DB"/>
+              <w:bottom w:val="single" w:sz="4" w:color="D1D5DB"/>
+              <w:left w:val="single" w:sz="4" w:color="D1D5DB"/>
+              <w:right w:val="single" w:sz="4" w:color="D1D5DB"/>
+            </w:tcBorders>
+          </w:tcPr>
+          <w:p>
+            <w:pPr>
+              <w:spacing w:before="0" w:after="0"/>
+              <w:jc w:val="center"/>
+            </w:pPr>
+            <w:r>
+              <w:rPr>
+                <w:color w:val="282828"/>
+                <w:sz w:val="18"/>
+              </w:rPr>
+              <w:t>CPU Frequency</w:t>
+            </w:r>
+          </w:p>
+        </w:tc>
+        <w:tc>
+          <w:tcPr>
+            <w:tcW w:type="dxa" w:w="2880"/>
+            <w:vAlign w:val="center"/>
+            <w:shd w:fill="F9FDF9"/>
+            <w:tcMar>
+              <w:top w:w="90" w:type="dxa"/>
+              <w:bottom w:w="90" w:type="dxa"/>
+              <w:left w:w="140" w:type="dxa"/>
+              <w:right w:w="140" w:type="dxa"/>
+            </w:tcMar>
+            <w:tcBorders>
+              <w:top w:val="single" w:sz="4" w:color="D1D5DB"/>
+              <w:bottom w:val="single" w:sz="4" w:color="D1D5DB"/>
+              <w:left w:val="single" w:sz="4" w:color="D1D5DB"/>
+              <w:right w:val="single" w:sz="4" w:color="D1D5DB"/>
+            </w:tcBorders>
+          </w:tcPr>
+          <w:p>
+            <w:pPr>
+              <w:spacing w:before="0" w:after="0"/>
+              <w:jc w:val="left"/>
+            </w:pPr>
+            <w:r>
+              <w:rPr>
+                <w:color w:val="282828"/>
+                <w:sz w:val="18"/>
+              </w:rPr>
+              <w:t>240MHz (WiFi)</w:t>
+            </w:r>
+          </w:p>
+        </w:tc>
+        <w:tc>
+          <w:tcPr>
+            <w:tcW w:type="dxa" w:w="3888"/>
+            <w:vAlign w:val="center"/>
+            <w:shd w:fill="F9FDF9"/>
+            <w:tcMar>
+              <w:top w:w="90" w:type="dxa"/>
+              <w:bottom w:w="90" w:type="dxa"/>
+              <w:left w:w="140" w:type="dxa"/>
+              <w:right w:w="140" w:type="dxa"/>
+            </w:tcMar>
+            <w:tcBorders>
+              <w:top w:val="single" w:sz="4" w:color="D1D5DB"/>
+              <w:bottom w:val="single" w:sz="4" w:color="D1D5DB"/>
+              <w:left w:val="single" w:sz="4" w:color="D1D5DB"/>
+              <w:right w:val="single" w:sz="4" w:color="D1D5DB"/>
+            </w:tcBorders>
+          </w:tcPr>
+          <w:p>
+            <w:pPr>
+              <w:spacing w:before="0" w:after="0"/>
+              <w:jc w:val="left"/>
+            </w:pPr>
+            <w:r>
+              <w:rPr>
+                <w:color w:val="282828"/>
+                <w:sz w:val="18"/>
+              </w:rPr>
+              <w:t>Kecepatan clock maksimal untuk pemrosesan kriptografi HTTPS &amp; Wi-Fi.</w:t>
+            </w:r>
+          </w:p>
+        </w:tc>
+      </w:tr>
+    </w:tbl>
+    <w:p>
+      <w:pPr>
+        <w:spacing w:before="0" w:after="120"/>
+      </w:pPr>
+    </w:p>
+    <w:p>
+      <w:r>
+        <w:br w:type="page"/>
+      </w:r>
+    </w:p>
+    <w:p>
+      <w:pPr>
+        <w:keepNext/>
+        <w:spacing w:before="240" w:after="80"/>
+      </w:pPr>
+      <w:r>
+        <w:rPr>
+          <w:rFonts w:ascii="Arial" w:hAnsi="Arial"/>
+          <w:b/>
+          <w:color w:val="2D6A4F"/>
+          <w:sz w:val="24"/>
+        </w:rPr>
+        <w:t>6.4 Penjelasan Arsitektur &amp; Logika Kode (Hard Programmer Notes)</w:t>
+      </w:r>
+    </w:p>
+    <w:p>
+      <w:r>
+        <w:t>Firmware NURTURE ditulis dengan menerapkan standar pemrograman embedded modern untuk menjamin keandalan 24/7:</w:t>
+        <w:br/>
+        <w:br/>
+        <w:t>1. Paradigma Eksekusi Non-Blocking (millis() Scheduling):</w:t>
+        <w:br/>
+        <w:t xml:space="preserve">   Program tidak menggunakan delay() untuk menjaga respon sistem. Seluruh tugas (pembacaan sensor tanah, NPK, RTC, kontrol aktuator, siaran UDP, dan pengiriman HTTPS) dijalankan menggunakan mesin status multi-interval berbasis millis().</w:t>
+        <w:br/>
+        <w:br/>
+        <w:t>2. Manajemen Protokol Modbus RTU RS485 (Sensor NPK 7-in-1):</w:t>
+        <w:br/>
+        <w:t xml:space="preserve">   Komunikasi RS485 ditangani oleh HardwareSerial(1) pada pin GPIO17 (TX), GPIO18 (RX), dan GPIO14 (DIR DE/RE). Fungsi membaca 7 register secara berurutan: Kelembapan (reg 0), Suhu (reg 1), EC (reg 2), pH (reg 3), Nitrogen (reg 4), Fosfor (reg 5), dan Kalium (reg 6). Data EC langsung bertipe integer satuan µS/cm tanpa pembagian skala.</w:t>
+        <w:br/>
+        <w:br/>
+        <w:t>3. Logika Otomasi Terjadwal RTC &amp; Perlindungan Fail-Safe:</w:t>
+        <w:br/>
+        <w:t xml:space="preserve">   • Waktu RTC dibaca tepat 1 kali per detik di loop utama untuk menghindari bentrokan lalu lintas pada bus I2C.</w:t>
+        <w:br/>
+        <w:t xml:space="preserve">   • Penyiraman Solenoid Valve aktif otomatis pada jam 07:00-07:10 (Pagi) dan 17:20-17:30 (Sore) selama 10 menit.</w:t>
+        <w:br/>
+        <w:t xml:space="preserve">   • Fitur Safety Timeout 15 Menit: Jika valve terbuka melebihi 15 menit, mikrokontroler secara otomatis memutus daya valve secara paksa untuk melindungi lahan dari kebanjiran dan melindungi kumparan solenoid dari panas berlebih.</w:t>
+        <w:br/>
+        <w:br/>
+        <w:t>4. Logika Sirkulasi Termal Kipas Boks (Exhaust Fan):</w:t>
+        <w:br/>
+        <w:t xml:space="preserve">   Jika sensor DHT22 dalam boks membaca suhu ≥ 34.0 °C, kipas dinyalakan selama 5 menit. Setelah siklus selesai, sistem mereset status siklus kipas sehingga jika boks masih terpapar panas matahari ekstrem, kipas langsung melanjutkan pendinginan pada siklus berikutnya.</w:t>
+        <w:br/>
+        <w:br/>
+        <w:t>5. Telemetri Ganda (Dual Telemetry Communication):</w:t>
+        <w:br/>
+        <w:t xml:space="preserve">   • Telemetri Lokal (UDP Port 4210): Siaran paket data JSON lengkap setiap 1 detik ke alamat broadcast subnet WiFi. Bebas kuota internet dan dapat dipantau langsung di lapangan menggunakan script cek_udp.py.</w:t>
+        <w:br/>
+        <w:t xml:space="preserve">   • Cloud IoT ThingSpeak: Mengunggah data setiap 16 detik (mendekati batas laju free tier ThingSpeak 15 detik). Pengunggahan dibagi menjadi Channel Utama dan Channel Pendukung berjeda 5 detik guna mencegah fragmentasi memori RAM (Heap exhaustion) saat negosiasi SSL/TLS.</w:t>
+      </w:r>
+    </w:p>
+    <w:tbl>
+      <w:tblPr>
+        <w:tblW w:type="auto" w:w="0"/>
+        <w:jc w:val="center"/>
+        <w:tblLayout w:type="fixed"/>
+        <w:tblLook w:firstColumn="1" w:firstRow="1" w:lastColumn="0" w:lastRow="0" w:noHBand="0" w:noVBand="1" w:val="04A0"/>
+      </w:tblPr>
+      <w:tblGrid>
+        <w:gridCol w:w="9360"/>
+      </w:tblGrid>
+      <w:tr>
+        <w:tc>
+          <w:tcPr>
+            <w:tcW w:type="dxa" w:w="9360"/>
+            <w:shd w:fill="F0FDF4"/>
+            <w:tcMar>
+              <w:top w:w="120" w:type="dxa"/>
+              <w:bottom w:w="120" w:type="dxa"/>
+              <w:left w:w="180" w:type="dxa"/>
+              <w:right w:w="180" w:type="dxa"/>
+            </w:tcMar>
+            <w:tcBorders>
+              <w:top w:val="none"/>
+              <w:bottom w:val="none"/>
+              <w:left w:val="single" w:sz="24" w:space="0" w:color="1E4620"/>
+              <w:right w:val="none"/>
+            </w:tcBorders>
+          </w:tcPr>
+          <w:p>
+            <w:pPr>
+              <w:spacing w:before="0" w:after="40"/>
+            </w:pPr>
+            <w:r>
+              <w:rPr>
+                <w:b/>
+                <w:color w:val="1E4620"/>
+                <w:sz w:val="20"/>
+              </w:rPr>
+              <w:t>💡 INFORMASI TEKNIS: Catatan Perbedaan Kode Node 1 dan Node 2</w:t>
+              <w:br/>
+            </w:r>
+            <w:r>
+              <w:rPr>
+                <w:color w:val="282828"/>
+                <w:sz w:val="19"/>
+              </w:rPr>
+              <w:t>• Node 1 (Stasiun Irigasi Utama): Mengendalikan Solenoid Valve pengairan (GPIO 5), Kipas (GPIO 39), Lampu UV (GPIO 15), 2 Probe Analog Tanah, dan Modul NPK 7-in-1.</w:t>
+              <w:br/>
+              <w:t>• Node 2 (Stasiun Monitoring Sekunder): Menangani pembacaan NPK 7-in-1, kontrol Kipas, dan modul INA226 Baterai dengan rumus pembalikan polaritas arus (arus_baterai = -rawI / 1000.0) agar pengisian siang hari terdeteksi positif.</w:t>
+            </w:r>
+          </w:p>
+        </w:tc>
+      </w:tr>
+    </w:tbl>
+    <w:p>
+      <w:pPr>
+        <w:spacing w:before="0" w:after="80"/>
+      </w:pPr>
+    </w:p>
     <w:sectPr>
       <w:headerReference w:type="default" r:id="rId9"/>
       <w:footerReference w:type="default" r:id="rId10"/>

</xml_diff>